<commit_message>
Đồng bộ hai website theo app bản 237 (KHGD Tiếng Việt 1 tuần 1 chia 2/2/6/2 theo SGV)
Co-Authored-By: Claude Opus 5 (1M context) <noreply@anthropic.com>
Claude-Session: https://claude.ai/code/session_01HLmY8gmbc3bt5a6aV9Q81U
</commit_message>
<xml_diff>
--- a/assets/docs/lop1/Tieng Viet - Lop 1.docx
+++ b/assets/docs/lop1/Tieng Viet - Lop 1.docx
@@ -605,7 +605,7 @@
                 <w:i w:val="0"/>
                 <w:sz w:val="20"/>
               </w:rPr>
-              <w:t>Tiết 1–3 (3 tiết)</w:t>
+              <w:t>Tiết 1–2 (2 tiết)</w:t>
             </w:r>
           </w:p>
         </w:tc>
@@ -733,7 +733,7 @@
                 <w:i w:val="0"/>
                 <w:sz w:val="20"/>
               </w:rPr>
-              <w:t>Tiết 4–6 (3 tiết)</w:t>
+              <w:t>Tiết 3–4 (2 tiết)</w:t>
             </w:r>
           </w:p>
         </w:tc>
@@ -841,7 +841,7 @@
                 <w:i w:val="0"/>
                 <w:sz w:val="20"/>
               </w:rPr>
-              <w:t>Làm quen với các nét viết cơ bản, các chữ số, dấu thanh và bảng chữ cái</w:t>
+              <w:t>Làm quen với các nét cơ bản, các chữ số, bảng chữ cái và dấu thanh</w:t>
             </w:r>
           </w:p>
         </w:tc>
@@ -861,7 +861,7 @@
                 <w:i w:val="0"/>
                 <w:sz w:val="20"/>
               </w:rPr>
-              <w:t>Tiết 7–9 (3 tiết)</w:t>
+              <w:t>Tiết 5–10 (6 tiết)</w:t>
             </w:r>
           </w:p>
         </w:tc>
@@ -976,7 +976,7 @@
                 <w:i w:val="0"/>
                 <w:sz w:val="20"/>
               </w:rPr>
-              <w:t>Tiết 10–12 (3 tiết)</w:t>
+              <w:t>Tiết 11–12 (2 tiết)</w:t>
             </w:r>
           </w:p>
         </w:tc>

</xml_diff>